<commit_message>
feat(platform): read-only reviewer mode + DGX investor-demo checklist
- Read-only mode via #...&ro=1: hides reset/settings/demo-controls and the
  failure-banner reset; shows a READ-ONLY badge; sticky in the shared URL. Live
  monitoring + 3D exploration stay fully interactive so a remote viewer cannot
  disrupt the live machine. Presenter uses the plain URL for full control.
- docs/DGX_DEMO_CHECKLIST.md: clone -> ./demo.sh --tunnel -> share-link runbook,
  90-second demo script, read-only link form, troubleshooting.
- README + DEPLOYMENT document the read-only link; PROTOTYPE_OVERVIEW.docx adds the
  read-only figure (19 figures total); screenshot gallery updated.

Co-Authored-By: Claude Opus 4.8 (1M context) <noreply@anthropic.com>
</commit_message>
<xml_diff>
--- a/docs/PROTOTYPE_OVERVIEW.docx
+++ b/docs/PROTOTYPE_OVERVIEW.docx
@@ -1597,6 +1597,63 @@
       </w:r>
     </w:p>
     <w:p>
+      <w:r>
+        <w:rPr>
+          <w:b w:val="0"/>
+          <w:i w:val="0"/>
+        </w:rPr>
+        <w:t>For investor / customer demos, append &amp;ro=1 for a read-only link: live monitoring stays fully interactive, but machine controls (reset, settings, fault injection) are hidden so a remote viewer can explore without disrupting the live machine. The presenter uses the plain URL for full control. See docs/DGX_DEMO_CHECKLIST.md.</w:t>
+      </w:r>
+    </w:p>
+    <w:p>
+      <w:r>
+        <w:drawing>
+          <wp:inline xmlns:a="http://schemas.openxmlformats.org/drawingml/2006/main" xmlns:pic="http://schemas.openxmlformats.org/drawingml/2006/picture">
+            <wp:extent cx="5943600" cy="3343275"/>
+            <wp:docPr id="18" name="Picture 18"/>
+            <wp:cNvGraphicFramePr>
+              <a:graphicFrameLocks noChangeAspect="1"/>
+            </wp:cNvGraphicFramePr>
+            <a:graphic>
+              <a:graphicData uri="http://schemas.openxmlformats.org/drawingml/2006/picture">
+                <pic:pic>
+                  <pic:nvPicPr>
+                    <pic:cNvPr id="0" name="23_readonly_review.png"/>
+                    <pic:cNvPicPr/>
+                  </pic:nvPicPr>
+                  <pic:blipFill>
+                    <a:blip r:embed="rId26"/>
+                    <a:stretch>
+                      <a:fillRect/>
+                    </a:stretch>
+                  </pic:blipFill>
+                  <pic:spPr>
+                    <a:xfrm>
+                      <a:off x="0" y="0"/>
+                      <a:ext cx="5943600" cy="3343275"/>
+                    </a:xfrm>
+                    <a:prstGeom prst="rect"/>
+                  </pic:spPr>
+                </pic:pic>
+              </a:graphicData>
+            </a:graphic>
+          </wp:inline>
+        </w:drawing>
+      </w:r>
+    </w:p>
+    <w:p>
+      <w:pPr>
+        <w:jc w:val="center"/>
+      </w:pPr>
+      <w:r>
+        <w:rPr>
+          <w:i/>
+          <w:sz w:val="18"/>
+        </w:rPr>
+        <w:t>Figure: Read-only review link (#…&amp;ro=1) — a READ-ONLY badge replaces the machine controls; the link opened straight into the Mold &amp; Clamp context.</w:t>
+      </w:r>
+    </w:p>
+    <w:p>
       <w:pPr>
         <w:pStyle w:val="Heading1"/>
       </w:pPr>
@@ -2077,7 +2134,7 @@
         <w:drawing>
           <wp:inline xmlns:a="http://schemas.openxmlformats.org/drawingml/2006/main" xmlns:pic="http://schemas.openxmlformats.org/drawingml/2006/picture">
             <wp:extent cx="5943600" cy="3714750"/>
-            <wp:docPr id="18" name="Picture 18"/>
+            <wp:docPr id="19" name="Picture 19"/>
             <wp:cNvGraphicFramePr>
               <a:graphicFrameLocks noChangeAspect="1"/>
             </wp:cNvGraphicFramePr>
@@ -2089,7 +2146,7 @@
                     <pic:cNvPicPr/>
                   </pic:nvPicPr>
                   <pic:blipFill>
-                    <a:blip r:embed="rId26"/>
+                    <a:blip r:embed="rId27"/>
                     <a:stretch>
                       <a:fillRect/>
                     </a:stretch>

</xml_diff>